<commit_message>
seguimos adicionando os arquivos do 03 ao 11
</commit_message>
<xml_diff>
--- a/docs/atas/ata-acordo-com-cliente-externo.docx
+++ b/docs/atas/ata-acordo-com-cliente-externo.docx
@@ -1,6 +1,6 @@
 
 <file path=word/document.xml><?xml version="1.0" encoding="utf-8"?>
-<w:document xmlns:wpc="http://schemas.microsoft.com/office/word/2010/wordprocessingCanvas" xmlns:cx="http://schemas.microsoft.com/office/drawing/2014/chartex" xmlns:cx1="http://schemas.microsoft.com/office/drawing/2015/9/8/chartex" xmlns:cx2="http://schemas.microsoft.com/office/drawing/2015/10/21/chartex" xmlns:cx3="http://schemas.microsoft.com/office/drawing/2016/5/9/chartex" xmlns:cx4="http://schemas.microsoft.com/office/drawing/2016/5/10/chartex" xmlns:cx5="http://schemas.microsoft.com/office/drawing/2016/5/11/chartex" xmlns:cx6="http://schemas.microsoft.com/office/drawing/2016/5/12/chartex" xmlns:cx7="http://schemas.microsoft.com/office/drawing/2016/5/13/chartex" xmlns:cx8="http://schemas.microsoft.com/office/drawing/2016/5/14/chartex" xmlns:mc="http://schemas.openxmlformats.org/markup-compatibility/2006" xmlns:aink="http://schemas.microsoft.com/office/drawing/2016/ink" xmlns:am3d="http://schemas.microsoft.com/office/drawing/2017/model3d" xmlns:o="urn:schemas-microsoft-com:office:office" xmlns:r="http://schemas.openxmlformats.org/officeDocument/2006/relationships" xmlns:m="http://schemas.openxmlformats.org/officeDocument/2006/math" xmlns:v="urn:schemas-microsoft-com:vml" xmlns:wp14="http://schemas.microsoft.com/office/word/2010/wordprocessingDrawing" xmlns:wp="http://schemas.openxmlformats.org/drawingml/2006/wordprocessingDrawing" xmlns:w10="urn:schemas-microsoft-com:office:word" xmlns:w="http://schemas.openxmlformats.org/wordprocessingml/2006/main" xmlns:w14="http://schemas.microsoft.com/office/word/2010/wordml" xmlns:w15="http://schemas.microsoft.com/office/word/2012/wordml" xmlns:w16cid="http://schemas.microsoft.com/office/word/2016/wordml/cid" xmlns:w16se="http://schemas.microsoft.com/office/word/2015/wordml/symex" xmlns:wpg="http://schemas.microsoft.com/office/word/2010/wordprocessingGroup" xmlns:wpi="http://schemas.microsoft.com/office/word/2010/wordprocessingInk" xmlns:wne="http://schemas.microsoft.com/office/word/2006/wordml" xmlns:wps="http://schemas.microsoft.com/office/word/2010/wordprocessingShape" mc:Ignorable="w14 w15 w16se w16cid wp14">
+<w:document xmlns:wpc="http://schemas.microsoft.com/office/word/2010/wordprocessingCanvas" xmlns:cx="http://schemas.microsoft.com/office/drawing/2014/chartex" xmlns:cx1="http://schemas.microsoft.com/office/drawing/2015/9/8/chartex" xmlns:cx2="http://schemas.microsoft.com/office/drawing/2015/10/21/chartex" xmlns:cx3="http://schemas.microsoft.com/office/drawing/2016/5/9/chartex" xmlns:cx4="http://schemas.microsoft.com/office/drawing/2016/5/10/chartex" xmlns:cx5="http://schemas.microsoft.com/office/drawing/2016/5/11/chartex" xmlns:cx6="http://schemas.microsoft.com/office/drawing/2016/5/12/chartex" xmlns:cx7="http://schemas.microsoft.com/office/drawing/2016/5/13/chartex" xmlns:cx8="http://schemas.microsoft.com/office/drawing/2016/5/14/chartex" xmlns:mc="http://schemas.openxmlformats.org/markup-compatibility/2006" xmlns:aink="http://schemas.microsoft.com/office/drawing/2016/ink" xmlns:am3d="http://schemas.microsoft.com/office/drawing/2017/model3d" xmlns:o="urn:schemas-microsoft-com:office:office" xmlns:oel="http://schemas.microsoft.com/office/2019/extlst" xmlns:r="http://schemas.openxmlformats.org/officeDocument/2006/relationships" xmlns:m="http://schemas.openxmlformats.org/officeDocument/2006/math" xmlns:v="urn:schemas-microsoft-com:vml" xmlns:wp14="http://schemas.microsoft.com/office/word/2010/wordprocessingDrawing" xmlns:wp="http://schemas.openxmlformats.org/drawingml/2006/wordprocessingDrawing" xmlns:w10="urn:schemas-microsoft-com:office:word" xmlns:w="http://schemas.openxmlformats.org/wordprocessingml/2006/main" xmlns:w14="http://schemas.microsoft.com/office/word/2010/wordml" xmlns:w15="http://schemas.microsoft.com/office/word/2012/wordml" xmlns:w16cex="http://schemas.microsoft.com/office/word/2018/wordml/cex" xmlns:w16cid="http://schemas.microsoft.com/office/word/2016/wordml/cid" xmlns:w16="http://schemas.microsoft.com/office/word/2018/wordml" xmlns:w16sdtdh="http://schemas.microsoft.com/office/word/2020/wordml/sdtdatahash" xmlns:w16se="http://schemas.microsoft.com/office/word/2015/wordml/symex" xmlns:wpg="http://schemas.microsoft.com/office/word/2010/wordprocessingGroup" xmlns:wpi="http://schemas.microsoft.com/office/word/2010/wordprocessingInk" xmlns:wne="http://schemas.microsoft.com/office/word/2006/wordml" xmlns:wps="http://schemas.microsoft.com/office/word/2010/wordprocessingShape" mc:Ignorable="w14 w15 w16se w16cid w16 w16cex w16sdtdh wp14">
   <w:body>
     <w:p>
       <w:pPr>
@@ -61,18 +61,15 @@
           <w:sz w:val="20"/>
           <w:szCs w:val="20"/>
         </w:rPr>
-        <w:t xml:space="preserve">Às </w:t>
-      </w:r>
-      <w:bookmarkStart w:id="0" w:name="_GoBack"/>
-      <w:r>
-        <w:rPr>
-          <w:rFonts w:ascii="Arial" w:hAnsi="Arial" w:cs="Arial"/>
-          <w:b/>
-          <w:sz w:val="20"/>
-          <w:szCs w:val="20"/>
-          <w:highlight w:val="yellow"/>
-        </w:rPr>
-        <w:t>XX</w:t>
+        <w:t>Às</w:t>
+      </w:r>
+      <w:r>
+        <w:rPr>
+          <w:rFonts w:ascii="Arial" w:hAnsi="Arial" w:cs="Arial"/>
+          <w:sz w:val="20"/>
+          <w:szCs w:val="20"/>
+        </w:rPr>
+        <w:t xml:space="preserve"> 18:00</w:t>
       </w:r>
       <w:r>
         <w:rPr>
@@ -84,7 +81,6 @@
         </w:rPr>
         <w:t xml:space="preserve"> </w:t>
       </w:r>
-      <w:bookmarkEnd w:id="0"/>
       <w:r>
         <w:rPr>
           <w:rFonts w:ascii="Arial" w:hAnsi="Arial" w:cs="Arial"/>
@@ -100,9 +96,8 @@
           <w:bCs/>
           <w:sz w:val="20"/>
           <w:szCs w:val="20"/>
-          <w:highlight w:val="yellow"/>
-        </w:rPr>
-        <w:t>DIA</w:t>
+        </w:rPr>
+        <w:t>27</w:t>
       </w:r>
       <w:r>
         <w:rPr>
@@ -128,17 +123,8 @@
           <w:b/>
           <w:sz w:val="20"/>
           <w:szCs w:val="20"/>
-          <w:highlight w:val="yellow"/>
-        </w:rPr>
-        <w:t>MÊS</w:t>
-      </w:r>
-      <w:r>
-        <w:rPr>
-          <w:rFonts w:ascii="Arial" w:hAnsi="Arial" w:cs="Arial"/>
-          <w:sz w:val="20"/>
-          <w:szCs w:val="20"/>
-        </w:rPr>
-        <w:t xml:space="preserve"> </w:t>
+        </w:rPr>
+        <w:t xml:space="preserve">abril </w:t>
       </w:r>
       <w:r>
         <w:rPr>
@@ -162,9 +148,8 @@
           <w:b/>
           <w:sz w:val="20"/>
           <w:szCs w:val="20"/>
-          <w:highlight w:val="yellow"/>
-        </w:rPr>
-        <w:t>ANO</w:t>
+        </w:rPr>
+        <w:t>2026</w:t>
       </w:r>
       <w:r>
         <w:rPr>
@@ -333,9 +318,8 @@
           <w:bCs/>
           <w:sz w:val="20"/>
           <w:szCs w:val="20"/>
-          <w:highlight w:val="yellow"/>
-        </w:rPr>
-        <w:t>NOME DA DISCIPLINA</w:t>
+        </w:rPr>
+        <w:t>Trabalho Interdisciplinar: Aplicações para Processos de Negócios</w:t>
       </w:r>
       <w:r>
         <w:rPr>
@@ -448,17 +432,24 @@
           <w:bCs/>
           <w:sz w:val="20"/>
           <w:szCs w:val="20"/>
-          <w:highlight w:val="yellow"/>
-        </w:rPr>
-        <w:t>NOME DO CURSO</w:t>
-      </w:r>
-      <w:r>
-        <w:rPr>
-          <w:rFonts w:ascii="Arial" w:hAnsi="Arial" w:cs="Arial"/>
-          <w:sz w:val="20"/>
-          <w:szCs w:val="20"/>
-        </w:rPr>
-        <w:t xml:space="preserve"> da PUC Minas</w:t>
+        </w:rPr>
+        <w:t>Análise e Desenvolvimento de Sistemas</w:t>
+      </w:r>
+      <w:r>
+        <w:rPr>
+          <w:rFonts w:ascii="Arial" w:hAnsi="Arial" w:cs="Arial"/>
+          <w:sz w:val="20"/>
+          <w:szCs w:val="20"/>
+        </w:rPr>
+        <w:t xml:space="preserve"> </w:t>
+      </w:r>
+      <w:r>
+        <w:rPr>
+          <w:rFonts w:ascii="Arial" w:hAnsi="Arial" w:cs="Arial"/>
+          <w:sz w:val="20"/>
+          <w:szCs w:val="20"/>
+        </w:rPr>
+        <w:t>da PUC Minas</w:t>
       </w:r>
       <w:r>
         <w:rPr>
@@ -518,14 +509,62 @@
       </w:r>
       <w:r>
         <w:rPr>
+          <w:rFonts w:ascii="Arial" w:hAnsi="Arial"/>
+          <w:b/>
+          <w:color w:val="000000"/>
+          <w:sz w:val="20"/>
+        </w:rPr>
+        <w:t>Paulo Augusto Isnard</w:t>
+      </w:r>
+      <w:r>
+        <w:rPr>
           <w:rFonts w:ascii="Arial" w:hAnsi="Arial" w:cs="Arial"/>
           <w:b/>
           <w:bCs/>
           <w:sz w:val="20"/>
           <w:szCs w:val="20"/>
-          <w:highlight w:val="yellow"/>
-        </w:rPr>
-        <w:t>NOME COMPLETO SEM ABREVIAÇÕES DO(A) DOCENTE</w:t>
+        </w:rPr>
+        <w:t>,</w:t>
+      </w:r>
+      <w:r>
+        <w:rPr>
+          <w:rFonts w:ascii="Arial" w:hAnsi="Arial" w:cs="Arial"/>
+          <w:sz w:val="20"/>
+          <w:szCs w:val="20"/>
+        </w:rPr>
+        <w:t xml:space="preserve"> professor</w:t>
+      </w:r>
+      <w:r>
+        <w:rPr>
+          <w:rFonts w:ascii="Arial" w:hAnsi="Arial" w:cs="Arial"/>
+          <w:sz w:val="20"/>
+          <w:szCs w:val="20"/>
+        </w:rPr>
+        <w:t>(a)</w:t>
+      </w:r>
+      <w:r>
+        <w:rPr>
+          <w:rFonts w:ascii="Arial" w:hAnsi="Arial" w:cs="Arial"/>
+          <w:sz w:val="20"/>
+          <w:szCs w:val="20"/>
+        </w:rPr>
+        <w:t xml:space="preserve"> da unidade curricular</w:t>
+      </w:r>
+      <w:r>
+        <w:rPr>
+          <w:rFonts w:ascii="Arial" w:hAnsi="Arial" w:cs="Arial"/>
+          <w:sz w:val="20"/>
+          <w:szCs w:val="20"/>
+        </w:rPr>
+        <w:t>;</w:t>
+      </w:r>
+      <w:r>
+        <w:rPr>
+          <w:rFonts w:ascii="Arial" w:hAnsi="Arial" w:cs="Arial"/>
+          <w:sz w:val="20"/>
+          <w:szCs w:val="20"/>
+        </w:rPr>
+        <w:t xml:space="preserve"> </w:t>
       </w:r>
       <w:r>
         <w:rPr>
@@ -535,58 +574,7 @@
           <w:sz w:val="20"/>
           <w:szCs w:val="20"/>
         </w:rPr>
-        <w:t>,</w:t>
-      </w:r>
-      <w:r>
-        <w:rPr>
-          <w:rFonts w:ascii="Arial" w:hAnsi="Arial" w:cs="Arial"/>
-          <w:sz w:val="20"/>
-          <w:szCs w:val="20"/>
-        </w:rPr>
-        <w:t xml:space="preserve"> professor</w:t>
-      </w:r>
-      <w:r>
-        <w:rPr>
-          <w:rFonts w:ascii="Arial" w:hAnsi="Arial" w:cs="Arial"/>
-          <w:sz w:val="20"/>
-          <w:szCs w:val="20"/>
-        </w:rPr>
-        <w:t>(a)</w:t>
-      </w:r>
-      <w:r>
-        <w:rPr>
-          <w:rFonts w:ascii="Arial" w:hAnsi="Arial" w:cs="Arial"/>
-          <w:sz w:val="20"/>
-          <w:szCs w:val="20"/>
-        </w:rPr>
-        <w:t xml:space="preserve"> da unidade curricular</w:t>
-      </w:r>
-      <w:r>
-        <w:rPr>
-          <w:rFonts w:ascii="Arial" w:hAnsi="Arial" w:cs="Arial"/>
-          <w:sz w:val="20"/>
-          <w:szCs w:val="20"/>
-        </w:rPr>
-        <w:t>;</w:t>
-      </w:r>
-      <w:r>
-        <w:rPr>
-          <w:rFonts w:ascii="Arial" w:hAnsi="Arial" w:cs="Arial"/>
-          <w:sz w:val="20"/>
-          <w:szCs w:val="20"/>
-        </w:rPr>
-        <w:t xml:space="preserve"> </w:t>
-      </w:r>
-      <w:r>
-        <w:rPr>
-          <w:rFonts w:ascii="Arial" w:hAnsi="Arial" w:cs="Arial"/>
-          <w:b/>
-          <w:bCs/>
-          <w:sz w:val="20"/>
-          <w:szCs w:val="20"/>
-          <w:highlight w:val="yellow"/>
-        </w:rPr>
-        <w:t>NOME DO CLIENTE EXTERNO</w:t>
+        <w:t>Lucas Cabral Gouvea</w:t>
       </w:r>
       <w:r>
         <w:rPr>
@@ -655,9 +643,8 @@
           <w:bCs/>
           <w:sz w:val="20"/>
           <w:szCs w:val="20"/>
-          <w:highlight w:val="yellow"/>
-        </w:rPr>
-        <w:t>NOME DA EMPRESA</w:t>
+        </w:rPr>
+        <w:t>Green Volt</w:t>
       </w:r>
       <w:r>
         <w:rPr>
@@ -690,9 +677,98 @@
           <w:bCs/>
           <w:sz w:val="20"/>
           <w:szCs w:val="20"/>
-          <w:highlight w:val="yellow"/>
-        </w:rPr>
-        <w:t>NOMES COMPLETOS SEM ABREVIAÇÕES DOS DISCENTES</w:t>
+        </w:rPr>
+        <w:t>Benedito Medeiros, Eduardo Henrick</w:t>
+      </w:r>
+      <w:r>
+        <w:rPr>
+          <w:rFonts w:ascii="Arial" w:hAnsi="Arial" w:cs="Arial"/>
+          <w:b/>
+          <w:bCs/>
+          <w:sz w:val="20"/>
+          <w:szCs w:val="20"/>
+        </w:rPr>
+        <w:t xml:space="preserve"> Souza Lopes</w:t>
+      </w:r>
+      <w:r>
+        <w:rPr>
+          <w:rFonts w:ascii="Arial" w:hAnsi="Arial" w:cs="Arial"/>
+          <w:b/>
+          <w:bCs/>
+          <w:sz w:val="20"/>
+          <w:szCs w:val="20"/>
+        </w:rPr>
+        <w:t>, Caique de Lima, Fabio Henrique</w:t>
+      </w:r>
+      <w:r>
+        <w:rPr>
+          <w:rFonts w:ascii="Arial" w:hAnsi="Arial" w:cs="Arial"/>
+          <w:b/>
+          <w:bCs/>
+          <w:sz w:val="20"/>
+          <w:szCs w:val="20"/>
+        </w:rPr>
+        <w:t xml:space="preserve"> </w:t>
+      </w:r>
+      <w:r>
+        <w:rPr>
+          <w:rFonts w:ascii="Arial" w:hAnsi="Arial" w:cs="Arial"/>
+          <w:b/>
+          <w:bCs/>
+          <w:sz w:val="20"/>
+          <w:szCs w:val="20"/>
+        </w:rPr>
+        <w:t>Alves Do Amaral Prado</w:t>
+      </w:r>
+      <w:r>
+        <w:rPr>
+          <w:rFonts w:ascii="Arial" w:hAnsi="Arial" w:cs="Arial"/>
+          <w:b/>
+          <w:bCs/>
+          <w:sz w:val="20"/>
+          <w:szCs w:val="20"/>
+        </w:rPr>
+        <w:t>, Gustavo Ferreira</w:t>
+      </w:r>
+      <w:r>
+        <w:rPr>
+          <w:rFonts w:ascii="Arial" w:hAnsi="Arial" w:cs="Arial"/>
+          <w:b/>
+          <w:bCs/>
+          <w:sz w:val="20"/>
+          <w:szCs w:val="20"/>
+        </w:rPr>
+        <w:t xml:space="preserve"> Lopes</w:t>
+      </w:r>
+      <w:r>
+        <w:rPr>
+          <w:rFonts w:ascii="Arial" w:hAnsi="Arial" w:cs="Arial"/>
+          <w:b/>
+          <w:bCs/>
+          <w:sz w:val="20"/>
+          <w:szCs w:val="20"/>
+        </w:rPr>
+        <w:t>, João Gabriel dos Santos, Matheus Aurélio, Raphael Henrique</w:t>
+      </w:r>
+      <w:r>
+        <w:rPr>
+          <w:rFonts w:ascii="Arial" w:hAnsi="Arial" w:cs="Arial"/>
+          <w:b/>
+          <w:bCs/>
+          <w:sz w:val="20"/>
+          <w:szCs w:val="20"/>
+        </w:rPr>
+        <w:t xml:space="preserve"> </w:t>
+      </w:r>
+      <w:r>
+        <w:rPr>
+          <w:rFonts w:ascii="Arial" w:hAnsi="Arial" w:cs="Arial"/>
+          <w:b/>
+          <w:bCs/>
+          <w:sz w:val="20"/>
+          <w:szCs w:val="20"/>
+        </w:rPr>
+        <w:t>Oliveira Santos, Victor Hugo Ribeiro, Wesley Andre Melo</w:t>
       </w:r>
       <w:r>
         <w:rPr>
@@ -1687,9 +1763,8 @@
           <w:bCs/>
           <w:sz w:val="20"/>
           <w:szCs w:val="20"/>
-          <w:highlight w:val="yellow"/>
-        </w:rPr>
-        <w:t>NOME DO CURSO</w:t>
+        </w:rPr>
+        <w:t>Análise e Desenvolvimento de Sistemas</w:t>
       </w:r>
       <w:r>
         <w:rPr>
@@ -2129,7 +2204,7 @@
           <w:sz w:val="20"/>
           <w:szCs w:val="20"/>
         </w:rPr>
-        <w:t>Belo Horizonte</w:t>
+        <w:t>Betim</w:t>
       </w:r>
       <w:r>
         <w:rPr>
@@ -2144,112 +2219,260 @@
           <w:rFonts w:ascii="Arial" w:hAnsi="Arial" w:cs="Arial"/>
           <w:sz w:val="20"/>
           <w:szCs w:val="20"/>
+        </w:rPr>
+        <w:t>27</w:t>
+      </w:r>
+      <w:r>
+        <w:rPr>
+          <w:rFonts w:ascii="Arial" w:hAnsi="Arial" w:cs="Arial"/>
+          <w:sz w:val="20"/>
+          <w:szCs w:val="20"/>
+        </w:rPr>
+        <w:t xml:space="preserve"> </w:t>
+      </w:r>
+      <w:r>
+        <w:rPr>
+          <w:rFonts w:ascii="Arial" w:hAnsi="Arial" w:cs="Arial"/>
+          <w:sz w:val="20"/>
+          <w:szCs w:val="20"/>
+        </w:rPr>
+        <w:t xml:space="preserve">de </w:t>
+      </w:r>
+      <w:r>
+        <w:rPr>
+          <w:rFonts w:ascii="Arial" w:hAnsi="Arial" w:cs="Arial"/>
+          <w:sz w:val="20"/>
+          <w:szCs w:val="20"/>
+        </w:rPr>
+        <w:t>abril</w:t>
+      </w:r>
+      <w:r>
+        <w:rPr>
+          <w:rFonts w:ascii="Arial" w:hAnsi="Arial" w:cs="Arial"/>
+          <w:sz w:val="20"/>
+          <w:szCs w:val="20"/>
+        </w:rPr>
+        <w:t xml:space="preserve"> </w:t>
+      </w:r>
+      <w:r>
+        <w:rPr>
+          <w:rFonts w:ascii="Arial" w:hAnsi="Arial" w:cs="Arial"/>
+          <w:sz w:val="20"/>
+          <w:szCs w:val="20"/>
+        </w:rPr>
+        <w:t xml:space="preserve">de </w:t>
+      </w:r>
+      <w:r>
+        <w:rPr>
+          <w:rFonts w:ascii="Arial" w:hAnsi="Arial" w:cs="Arial"/>
+          <w:sz w:val="20"/>
+          <w:szCs w:val="20"/>
+        </w:rPr>
+        <w:t>2026</w:t>
+      </w:r>
+      <w:r>
+        <w:rPr>
+          <w:rFonts w:ascii="Arial" w:hAnsi="Arial" w:cs="Arial"/>
+          <w:sz w:val="20"/>
+          <w:szCs w:val="20"/>
+        </w:rPr>
+        <w:t>.</w:t>
+      </w:r>
+    </w:p>
+    <w:p>
+      <w:pPr>
+        <w:spacing w:line="360" w:lineRule="auto"/>
+        <w:jc w:val="both"/>
+        <w:rPr>
+          <w:rFonts w:ascii="Arial" w:hAnsi="Arial" w:cs="Arial"/>
+          <w:sz w:val="20"/>
+          <w:szCs w:val="20"/>
+        </w:rPr>
+      </w:pPr>
+    </w:p>
+    <w:p>
+      <w:pPr>
+        <w:spacing w:line="360" w:lineRule="auto"/>
+        <w:jc w:val="both"/>
+        <w:rPr>
+          <w:rFonts w:ascii="Arial" w:hAnsi="Arial" w:cs="Arial"/>
+          <w:sz w:val="20"/>
+          <w:szCs w:val="20"/>
+        </w:rPr>
+      </w:pPr>
+    </w:p>
+    <w:p>
+      <w:pPr>
+        <w:spacing w:line="360" w:lineRule="auto"/>
+        <w:jc w:val="both"/>
+        <w:rPr>
+          <w:rFonts w:ascii="Arial" w:hAnsi="Arial" w:cs="Arial"/>
+          <w:sz w:val="20"/>
+          <w:szCs w:val="20"/>
+        </w:rPr>
+      </w:pPr>
+      <w:r>
+        <w:rPr>
+          <w:rFonts w:ascii="Arial" w:hAnsi="Arial" w:cs="Arial"/>
+          <w:sz w:val="20"/>
+          <w:szCs w:val="20"/>
+        </w:rPr>
+        <w:t>__________________________________________________</w:t>
+      </w:r>
+    </w:p>
+    <w:p>
+      <w:pPr>
+        <w:pStyle w:val="Corpodetexto"/>
+        <w:spacing w:before="158"/>
+        <w:rPr>
+          <w:noProof/>
+        </w:rPr>
+      </w:pPr>
+      <w:r>
+        <w:rPr>
+          <w:rFonts w:ascii="Arial" w:hAnsi="Arial"/>
+          <w:b/>
+          <w:color w:val="000000"/>
+        </w:rPr>
+        <w:t>Benedito Medeiros</w:t>
+      </w:r>
+    </w:p>
+    <w:p>
+      <w:pPr>
+        <w:spacing w:line="360" w:lineRule="auto"/>
+        <w:jc w:val="both"/>
+        <w:rPr>
+          <w:rFonts w:ascii="Arial" w:hAnsi="Arial" w:cs="Arial"/>
+          <w:sz w:val="20"/>
+          <w:szCs w:val="20"/>
+        </w:rPr>
+      </w:pPr>
+    </w:p>
+    <w:p>
+      <w:pPr>
+        <w:spacing w:line="360" w:lineRule="auto"/>
+        <w:jc w:val="both"/>
+        <w:rPr>
+          <w:rFonts w:ascii="Arial" w:hAnsi="Arial" w:cs="Arial"/>
+          <w:sz w:val="20"/>
+          <w:szCs w:val="20"/>
+        </w:rPr>
+      </w:pPr>
+    </w:p>
+    <w:p>
+      <w:pPr>
+        <w:spacing w:line="360" w:lineRule="auto"/>
+        <w:jc w:val="both"/>
+        <w:rPr>
+          <w:rFonts w:ascii="Arial" w:hAnsi="Arial" w:cs="Arial"/>
+          <w:sz w:val="20"/>
+          <w:szCs w:val="20"/>
+        </w:rPr>
+      </w:pPr>
+    </w:p>
+    <w:p>
+      <w:pPr>
+        <w:spacing w:line="360" w:lineRule="auto"/>
+        <w:jc w:val="both"/>
+        <w:rPr>
+          <w:rFonts w:ascii="Arial" w:hAnsi="Arial" w:cs="Arial"/>
+          <w:sz w:val="20"/>
+          <w:szCs w:val="20"/>
+        </w:rPr>
+      </w:pPr>
+      <w:r>
+        <w:rPr>
+          <w:rFonts w:ascii="Arial" w:hAnsi="Arial" w:cs="Arial"/>
+          <w:sz w:val="20"/>
+          <w:szCs w:val="20"/>
+        </w:rPr>
+        <w:t>__________________________________________________</w:t>
+      </w:r>
+    </w:p>
+    <w:p>
+      <w:pPr>
+        <w:pStyle w:val="Corpodetexto"/>
+        <w:spacing w:before="118"/>
+        <w:ind w:left="2"/>
+      </w:pPr>
+      <w:r>
+        <w:rPr>
+          <w:color w:val="000000"/>
+        </w:rPr>
+        <w:t>Eduardo Henrick Souza Lopes</w:t>
+      </w:r>
+    </w:p>
+    <w:p>
+      <w:pPr>
+        <w:spacing w:line="360" w:lineRule="auto"/>
+        <w:jc w:val="both"/>
+        <w:rPr>
+          <w:rFonts w:ascii="Arial" w:hAnsi="Arial" w:cs="Arial"/>
+          <w:sz w:val="20"/>
+          <w:szCs w:val="20"/>
           <w:highlight w:val="yellow"/>
         </w:rPr>
-        <w:t>DIA</w:t>
-      </w:r>
-      <w:r>
-        <w:rPr>
-          <w:rFonts w:ascii="Arial" w:hAnsi="Arial" w:cs="Arial"/>
-          <w:sz w:val="20"/>
-          <w:szCs w:val="20"/>
-        </w:rPr>
-        <w:t xml:space="preserve"> </w:t>
-      </w:r>
-      <w:r>
-        <w:rPr>
-          <w:rFonts w:ascii="Arial" w:hAnsi="Arial" w:cs="Arial"/>
-          <w:sz w:val="20"/>
-          <w:szCs w:val="20"/>
-        </w:rPr>
-        <w:t xml:space="preserve">de </w:t>
-      </w:r>
-      <w:r>
+      </w:pPr>
+    </w:p>
+    <w:p>
+      <w:pPr>
+        <w:spacing w:line="360" w:lineRule="auto"/>
+        <w:jc w:val="both"/>
         <w:rPr>
           <w:rFonts w:ascii="Arial" w:hAnsi="Arial" w:cs="Arial"/>
           <w:sz w:val="20"/>
           <w:szCs w:val="20"/>
           <w:highlight w:val="yellow"/>
         </w:rPr>
-        <w:t>MÊS</w:t>
-      </w:r>
-      <w:r>
-        <w:rPr>
-          <w:rFonts w:ascii="Arial" w:hAnsi="Arial" w:cs="Arial"/>
-          <w:sz w:val="20"/>
-          <w:szCs w:val="20"/>
-        </w:rPr>
-        <w:t xml:space="preserve"> </w:t>
-      </w:r>
-      <w:r>
-        <w:rPr>
-          <w:rFonts w:ascii="Arial" w:hAnsi="Arial" w:cs="Arial"/>
-          <w:sz w:val="20"/>
-          <w:szCs w:val="20"/>
-        </w:rPr>
-        <w:t xml:space="preserve">de </w:t>
-      </w:r>
-      <w:r>
+      </w:pPr>
+    </w:p>
+    <w:p>
+      <w:pPr>
+        <w:spacing w:line="360" w:lineRule="auto"/>
+        <w:jc w:val="both"/>
         <w:rPr>
           <w:rFonts w:ascii="Arial" w:hAnsi="Arial" w:cs="Arial"/>
           <w:sz w:val="20"/>
           <w:szCs w:val="20"/>
           <w:highlight w:val="yellow"/>
         </w:rPr>
-        <w:t>ANO</w:t>
-      </w:r>
-      <w:r>
-        <w:rPr>
-          <w:rFonts w:ascii="Arial" w:hAnsi="Arial" w:cs="Arial"/>
-          <w:sz w:val="20"/>
-          <w:szCs w:val="20"/>
-        </w:rPr>
-        <w:t>.</w:t>
-      </w:r>
-    </w:p>
-    <w:p>
-      <w:pPr>
-        <w:spacing w:line="360" w:lineRule="auto"/>
-        <w:jc w:val="both"/>
-        <w:rPr>
-          <w:rFonts w:ascii="Arial" w:hAnsi="Arial" w:cs="Arial"/>
-          <w:sz w:val="20"/>
-          <w:szCs w:val="20"/>
-        </w:rPr>
-      </w:pPr>
-    </w:p>
-    <w:p>
-      <w:pPr>
-        <w:spacing w:line="360" w:lineRule="auto"/>
-        <w:jc w:val="both"/>
-        <w:rPr>
-          <w:rFonts w:ascii="Arial" w:hAnsi="Arial" w:cs="Arial"/>
-          <w:sz w:val="20"/>
-          <w:szCs w:val="20"/>
-        </w:rPr>
-      </w:pPr>
-    </w:p>
-    <w:p>
-      <w:pPr>
-        <w:spacing w:line="360" w:lineRule="auto"/>
-        <w:jc w:val="both"/>
-        <w:rPr>
-          <w:rFonts w:ascii="Arial" w:hAnsi="Arial" w:cs="Arial"/>
-          <w:sz w:val="20"/>
-          <w:szCs w:val="20"/>
-        </w:rPr>
-      </w:pPr>
-      <w:r>
-        <w:rPr>
-          <w:rFonts w:ascii="Arial" w:hAnsi="Arial" w:cs="Arial"/>
-          <w:sz w:val="20"/>
-          <w:szCs w:val="20"/>
-        </w:rPr>
+      </w:pPr>
+    </w:p>
+    <w:p>
+      <w:pPr>
+        <w:spacing w:line="360" w:lineRule="auto"/>
+        <w:jc w:val="both"/>
+        <w:rPr>
+          <w:rFonts w:ascii="Arial" w:hAnsi="Arial" w:cs="Arial"/>
+          <w:sz w:val="20"/>
+          <w:szCs w:val="20"/>
+        </w:rPr>
+      </w:pPr>
+      <w:r>
+        <w:rPr>
+          <w:rFonts w:ascii="Arial" w:hAnsi="Arial" w:cs="Arial"/>
+          <w:sz w:val="20"/>
+          <w:szCs w:val="20"/>
+        </w:rPr>
+        <w:lastRenderedPageBreak/>
         <w:t>__________________________________________________</w:t>
       </w:r>
     </w:p>
     <w:p>
       <w:pPr>
+        <w:pStyle w:val="Corpodetexto"/>
+      </w:pPr>
+      <w:r>
+        <w:rPr>
+          <w:rFonts w:ascii="Arial" w:hAnsi="Arial"/>
+          <w:b/>
+          <w:color w:val="000000"/>
+        </w:rPr>
+        <w:t>Caique de Lima</w:t>
+      </w:r>
+    </w:p>
+    <w:p>
+      <w:pPr>
         <w:spacing w:line="360" w:lineRule="auto"/>
         <w:jc w:val="both"/>
         <w:rPr>
@@ -2259,65 +2482,96 @@
           <w:highlight w:val="yellow"/>
         </w:rPr>
       </w:pPr>
-      <w:r>
+    </w:p>
+    <w:p>
+      <w:pPr>
+        <w:spacing w:line="360" w:lineRule="auto"/>
+        <w:jc w:val="both"/>
         <w:rPr>
           <w:rFonts w:ascii="Arial" w:hAnsi="Arial" w:cs="Arial"/>
           <w:sz w:val="20"/>
           <w:szCs w:val="20"/>
           <w:highlight w:val="yellow"/>
         </w:rPr>
-        <w:t xml:space="preserve">NOME COMPLETO </w:t>
-      </w:r>
-      <w:r>
-        <w:rPr>
-          <w:rFonts w:ascii="Arial" w:hAnsi="Arial" w:cs="Arial"/>
-          <w:bCs/>
+      </w:pPr>
+    </w:p>
+    <w:p>
+      <w:pPr>
+        <w:spacing w:line="360" w:lineRule="auto"/>
+        <w:jc w:val="both"/>
+        <w:rPr>
+          <w:rFonts w:ascii="Arial" w:hAnsi="Arial" w:cs="Arial"/>
+          <w:sz w:val="20"/>
+          <w:szCs w:val="20"/>
+        </w:rPr>
+      </w:pPr>
+    </w:p>
+    <w:p>
+      <w:pPr>
+        <w:spacing w:line="360" w:lineRule="auto"/>
+        <w:jc w:val="both"/>
+        <w:rPr>
+          <w:rFonts w:ascii="Arial" w:hAnsi="Arial" w:cs="Arial"/>
+          <w:sz w:val="20"/>
+          <w:szCs w:val="20"/>
+        </w:rPr>
+      </w:pPr>
+      <w:r>
+        <w:rPr>
+          <w:rFonts w:ascii="Arial" w:hAnsi="Arial" w:cs="Arial"/>
+          <w:sz w:val="20"/>
+          <w:szCs w:val="20"/>
+        </w:rPr>
+        <w:t>__________________________________________________</w:t>
+      </w:r>
+    </w:p>
+    <w:p>
+      <w:pPr>
+        <w:pStyle w:val="Corpodetexto"/>
+      </w:pPr>
+      <w:r>
+        <w:rPr>
+          <w:rFonts w:ascii="Arial" w:hAnsi="Arial"/>
+          <w:b/>
+          <w:color w:val="000000"/>
+        </w:rPr>
+        <w:t>Fabio Henrique Alves Do Amaral Prado</w:t>
+      </w:r>
+    </w:p>
+    <w:p>
+      <w:pPr>
+        <w:spacing w:line="360" w:lineRule="auto"/>
+        <w:jc w:val="both"/>
+        <w:rPr>
+          <w:rFonts w:ascii="Arial" w:hAnsi="Arial" w:cs="Arial"/>
           <w:sz w:val="20"/>
           <w:szCs w:val="20"/>
           <w:highlight w:val="yellow"/>
-        </w:rPr>
-        <w:t xml:space="preserve">SEM ABREVIAÇÕES </w:t>
-      </w:r>
-      <w:r>
+          <w:lang w:val="pt-PT"/>
+        </w:rPr>
+      </w:pPr>
+    </w:p>
+    <w:p>
+      <w:pPr>
+        <w:spacing w:line="360" w:lineRule="auto"/>
+        <w:jc w:val="both"/>
         <w:rPr>
           <w:rFonts w:ascii="Arial" w:hAnsi="Arial" w:cs="Arial"/>
           <w:sz w:val="20"/>
           <w:szCs w:val="20"/>
           <w:highlight w:val="yellow"/>
         </w:rPr>
-        <w:t>DO(A) DISCENTE</w:t>
-      </w:r>
-    </w:p>
-    <w:p>
-      <w:pPr>
-        <w:spacing w:line="360" w:lineRule="auto"/>
-        <w:jc w:val="both"/>
-        <w:rPr>
-          <w:rFonts w:ascii="Arial" w:hAnsi="Arial" w:cs="Arial"/>
-          <w:sz w:val="20"/>
-          <w:szCs w:val="20"/>
-        </w:rPr>
-      </w:pPr>
-    </w:p>
-    <w:p>
-      <w:pPr>
-        <w:spacing w:line="360" w:lineRule="auto"/>
-        <w:jc w:val="both"/>
-        <w:rPr>
-          <w:rFonts w:ascii="Arial" w:hAnsi="Arial" w:cs="Arial"/>
-          <w:sz w:val="20"/>
-          <w:szCs w:val="20"/>
-        </w:rPr>
-      </w:pPr>
-    </w:p>
-    <w:p>
-      <w:pPr>
-        <w:spacing w:line="360" w:lineRule="auto"/>
-        <w:jc w:val="both"/>
-        <w:rPr>
-          <w:rFonts w:ascii="Arial" w:hAnsi="Arial" w:cs="Arial"/>
-          <w:sz w:val="20"/>
-          <w:szCs w:val="20"/>
+      </w:pPr>
+    </w:p>
+    <w:p>
+      <w:pPr>
+        <w:spacing w:line="360" w:lineRule="auto"/>
+        <w:jc w:val="both"/>
+        <w:rPr>
+          <w:rFonts w:ascii="Arial" w:hAnsi="Arial" w:cs="Arial"/>
+          <w:sz w:val="20"/>
+          <w:szCs w:val="20"/>
+          <w:highlight w:val="yellow"/>
         </w:rPr>
       </w:pPr>
     </w:p>
@@ -2342,6 +2596,19 @@
     </w:p>
     <w:p>
       <w:pPr>
+        <w:pStyle w:val="Corpodetexto"/>
+      </w:pPr>
+      <w:r>
+        <w:rPr>
+          <w:rFonts w:ascii="Arial" w:hAnsi="Arial"/>
+          <w:b/>
+          <w:color w:val="000000"/>
+        </w:rPr>
+        <w:t>Gustavo Ferreira Lopes</w:t>
+      </w:r>
+    </w:p>
+    <w:p>
+      <w:pPr>
         <w:spacing w:line="360" w:lineRule="auto"/>
         <w:jc w:val="both"/>
         <w:rPr>
@@ -2351,34 +2618,205 @@
           <w:highlight w:val="yellow"/>
         </w:rPr>
       </w:pPr>
-      <w:r>
+    </w:p>
+    <w:p>
+      <w:pPr>
+        <w:spacing w:line="360" w:lineRule="auto"/>
+        <w:jc w:val="both"/>
         <w:rPr>
           <w:rFonts w:ascii="Arial" w:hAnsi="Arial" w:cs="Arial"/>
           <w:sz w:val="20"/>
           <w:szCs w:val="20"/>
           <w:highlight w:val="yellow"/>
         </w:rPr>
-        <w:t xml:space="preserve">NOME COMPLETO </w:t>
-      </w:r>
-      <w:r>
-        <w:rPr>
-          <w:rFonts w:ascii="Arial" w:hAnsi="Arial" w:cs="Arial"/>
-          <w:bCs/>
+      </w:pPr>
+    </w:p>
+    <w:p>
+      <w:pPr>
+        <w:spacing w:line="360" w:lineRule="auto"/>
+        <w:jc w:val="both"/>
+        <w:rPr>
+          <w:rFonts w:ascii="Arial" w:hAnsi="Arial" w:cs="Arial"/>
           <w:sz w:val="20"/>
           <w:szCs w:val="20"/>
           <w:highlight w:val="yellow"/>
         </w:rPr>
-        <w:t xml:space="preserve">SEM ABREVIAÇÕES </w:t>
-      </w:r>
-      <w:r>
+      </w:pPr>
+    </w:p>
+    <w:p>
+      <w:pPr>
+        <w:spacing w:line="360" w:lineRule="auto"/>
+        <w:jc w:val="both"/>
+        <w:rPr>
+          <w:rFonts w:ascii="Arial" w:hAnsi="Arial" w:cs="Arial"/>
+          <w:sz w:val="20"/>
+          <w:szCs w:val="20"/>
+        </w:rPr>
+      </w:pPr>
+      <w:r>
+        <w:rPr>
+          <w:rFonts w:ascii="Arial" w:hAnsi="Arial" w:cs="Arial"/>
+          <w:sz w:val="20"/>
+          <w:szCs w:val="20"/>
+        </w:rPr>
+        <w:t>__________________________________________________</w:t>
+      </w:r>
+    </w:p>
+    <w:p>
+      <w:pPr>
+        <w:pStyle w:val="Corpodetexto"/>
+      </w:pPr>
+      <w:r>
+        <w:rPr>
+          <w:rFonts w:ascii="Arial" w:hAnsi="Arial"/>
+          <w:b/>
+          <w:color w:val="000000"/>
+        </w:rPr>
+        <w:t>João Gabriel dos Santos</w:t>
+      </w:r>
+    </w:p>
+    <w:p>
+      <w:pPr>
+        <w:spacing w:line="360" w:lineRule="auto"/>
+        <w:jc w:val="both"/>
+        <w:rPr>
+          <w:rFonts w:ascii="Arial" w:hAnsi="Arial" w:cs="Arial"/>
+          <w:sz w:val="20"/>
+          <w:szCs w:val="20"/>
+        </w:rPr>
+      </w:pPr>
+    </w:p>
+    <w:p>
+      <w:pPr>
+        <w:spacing w:line="360" w:lineRule="auto"/>
+        <w:jc w:val="both"/>
+        <w:rPr>
+          <w:rFonts w:ascii="Arial" w:hAnsi="Arial" w:cs="Arial"/>
+          <w:sz w:val="20"/>
+          <w:szCs w:val="20"/>
+        </w:rPr>
+      </w:pPr>
+    </w:p>
+    <w:p>
+      <w:pPr>
+        <w:spacing w:line="360" w:lineRule="auto"/>
+        <w:jc w:val="both"/>
+        <w:rPr>
+          <w:rFonts w:ascii="Arial" w:hAnsi="Arial" w:cs="Arial"/>
+          <w:sz w:val="20"/>
+          <w:szCs w:val="20"/>
+        </w:rPr>
+      </w:pPr>
+    </w:p>
+    <w:p>
+      <w:pPr>
+        <w:spacing w:line="360" w:lineRule="auto"/>
+        <w:jc w:val="both"/>
+        <w:rPr>
+          <w:rFonts w:ascii="Arial" w:hAnsi="Arial" w:cs="Arial"/>
+          <w:sz w:val="20"/>
+          <w:szCs w:val="20"/>
+        </w:rPr>
+      </w:pPr>
+      <w:r>
+        <w:rPr>
+          <w:rFonts w:ascii="Arial" w:hAnsi="Arial" w:cs="Arial"/>
+          <w:sz w:val="20"/>
+          <w:szCs w:val="20"/>
+        </w:rPr>
+        <w:t>__________________________________________________</w:t>
+      </w:r>
+    </w:p>
+    <w:p>
+      <w:pPr>
+        <w:pStyle w:val="Corpodetexto"/>
+      </w:pPr>
+      <w:r>
+        <w:rPr>
+          <w:rFonts w:ascii="Arial" w:hAnsi="Arial"/>
+          <w:b/>
+          <w:color w:val="000000"/>
+        </w:rPr>
+        <w:t>Matheus Aurélio</w:t>
+      </w:r>
+    </w:p>
+    <w:p>
+      <w:pPr>
+        <w:spacing w:line="360" w:lineRule="auto"/>
+        <w:jc w:val="both"/>
+        <w:rPr>
+          <w:rFonts w:ascii="Arial" w:hAnsi="Arial" w:cs="Arial"/>
+          <w:sz w:val="20"/>
+          <w:szCs w:val="20"/>
+        </w:rPr>
+      </w:pPr>
+    </w:p>
+    <w:p>
+      <w:pPr>
+        <w:spacing w:line="360" w:lineRule="auto"/>
+        <w:jc w:val="both"/>
+        <w:rPr>
+          <w:rFonts w:ascii="Arial" w:hAnsi="Arial" w:cs="Arial"/>
+          <w:sz w:val="20"/>
+          <w:szCs w:val="20"/>
+        </w:rPr>
+      </w:pPr>
+    </w:p>
+    <w:p>
+      <w:pPr>
+        <w:spacing w:line="360" w:lineRule="auto"/>
+        <w:jc w:val="both"/>
+        <w:rPr>
+          <w:rFonts w:ascii="Arial" w:hAnsi="Arial" w:cs="Arial"/>
+          <w:sz w:val="20"/>
+          <w:szCs w:val="20"/>
+        </w:rPr>
+      </w:pPr>
+    </w:p>
+    <w:p>
+      <w:pPr>
+        <w:spacing w:line="360" w:lineRule="auto"/>
+        <w:jc w:val="both"/>
+        <w:rPr>
+          <w:rFonts w:ascii="Arial" w:hAnsi="Arial" w:cs="Arial"/>
+          <w:sz w:val="20"/>
+          <w:szCs w:val="20"/>
+        </w:rPr>
+      </w:pPr>
+      <w:r>
+        <w:rPr>
+          <w:rFonts w:ascii="Arial" w:hAnsi="Arial" w:cs="Arial"/>
+          <w:sz w:val="20"/>
+          <w:szCs w:val="20"/>
+        </w:rPr>
+        <w:t>__________________________________________________</w:t>
+      </w:r>
+    </w:p>
+    <w:p>
+      <w:pPr>
+        <w:pStyle w:val="Corpodetexto"/>
+      </w:pPr>
+      <w:r>
+        <w:rPr>
+          <w:rFonts w:ascii="Arial" w:hAnsi="Arial"/>
+          <w:b/>
+          <w:color w:val="000000"/>
+        </w:rPr>
+        <w:t>Raphael Henrique Oliveira Santos</w:t>
+      </w:r>
+    </w:p>
+    <w:p>
+      <w:pPr>
+        <w:spacing w:line="360" w:lineRule="auto"/>
+        <w:jc w:val="both"/>
         <w:rPr>
           <w:rFonts w:ascii="Arial" w:hAnsi="Arial" w:cs="Arial"/>
           <w:sz w:val="20"/>
           <w:szCs w:val="20"/>
           <w:highlight w:val="yellow"/>
-        </w:rPr>
-        <w:t>DO(A) DISCENTE</w:t>
-      </w:r>
+          <w:lang w:val="pt-PT"/>
+        </w:rPr>
+      </w:pPr>
     </w:p>
     <w:p>
       <w:pPr>
@@ -2389,6 +2827,7 @@
           <w:sz w:val="20"/>
           <w:szCs w:val="20"/>
           <w:highlight w:val="yellow"/>
+          <w:lang w:val="pt-PT"/>
         </w:rPr>
       </w:pPr>
     </w:p>
@@ -2401,8 +2840,45 @@
           <w:sz w:val="20"/>
           <w:szCs w:val="20"/>
           <w:highlight w:val="yellow"/>
-        </w:rPr>
-      </w:pPr>
+          <w:lang w:val="pt-PT"/>
+        </w:rPr>
+      </w:pPr>
+    </w:p>
+    <w:p>
+      <w:pPr>
+        <w:spacing w:line="360" w:lineRule="auto"/>
+        <w:jc w:val="both"/>
+        <w:rPr>
+          <w:rFonts w:ascii="Arial" w:hAnsi="Arial" w:cs="Arial"/>
+          <w:sz w:val="20"/>
+          <w:szCs w:val="20"/>
+        </w:rPr>
+      </w:pPr>
+      <w:r>
+        <w:rPr>
+          <w:rFonts w:ascii="Arial" w:hAnsi="Arial" w:cs="Arial"/>
+          <w:sz w:val="20"/>
+          <w:szCs w:val="20"/>
+        </w:rPr>
+        <w:t>__________________________________________________</w:t>
+      </w:r>
+    </w:p>
+    <w:p>
+      <w:pPr>
+        <w:pStyle w:val="Corpodetexto"/>
+        <w:spacing w:before="158"/>
+        <w:rPr>
+          <w:noProof/>
+        </w:rPr>
+      </w:pPr>
+      <w:r>
+        <w:rPr>
+          <w:rFonts w:ascii="Arial" w:hAnsi="Arial"/>
+          <w:b/>
+          <w:color w:val="000000"/>
+        </w:rPr>
+        <w:t>Victor Hugo Ribeiro</w:t>
+      </w:r>
     </w:p>
     <w:p>
       <w:pPr>
@@ -2413,27 +2889,9 @@
           <w:sz w:val="20"/>
           <w:szCs w:val="20"/>
           <w:highlight w:val="yellow"/>
-        </w:rPr>
-      </w:pPr>
-    </w:p>
-    <w:p>
-      <w:pPr>
-        <w:spacing w:line="360" w:lineRule="auto"/>
-        <w:jc w:val="both"/>
-        <w:rPr>
-          <w:rFonts w:ascii="Arial" w:hAnsi="Arial" w:cs="Arial"/>
-          <w:sz w:val="20"/>
-          <w:szCs w:val="20"/>
-        </w:rPr>
-      </w:pPr>
-      <w:r>
-        <w:rPr>
-          <w:rFonts w:ascii="Arial" w:hAnsi="Arial" w:cs="Arial"/>
-          <w:sz w:val="20"/>
-          <w:szCs w:val="20"/>
-        </w:rPr>
-        <w:t>__________________________________________________</w:t>
-      </w:r>
+          <w:lang w:val="pt-PT"/>
+        </w:rPr>
+      </w:pPr>
     </w:p>
     <w:p>
       <w:pPr>
@@ -2444,36 +2902,80 @@
           <w:sz w:val="20"/>
           <w:szCs w:val="20"/>
           <w:highlight w:val="yellow"/>
-        </w:rPr>
-      </w:pPr>
-      <w:r>
+          <w:lang w:val="pt-PT"/>
+        </w:rPr>
+      </w:pPr>
+    </w:p>
+    <w:p>
+      <w:pPr>
+        <w:spacing w:line="360" w:lineRule="auto"/>
+        <w:jc w:val="both"/>
         <w:rPr>
           <w:rFonts w:ascii="Arial" w:hAnsi="Arial" w:cs="Arial"/>
           <w:sz w:val="20"/>
           <w:szCs w:val="20"/>
           <w:highlight w:val="yellow"/>
-        </w:rPr>
-        <w:t xml:space="preserve">NOME COMPLETO </w:t>
-      </w:r>
-      <w:r>
-        <w:rPr>
-          <w:rFonts w:ascii="Arial" w:hAnsi="Arial" w:cs="Arial"/>
-          <w:bCs/>
+          <w:lang w:val="pt-PT"/>
+        </w:rPr>
+      </w:pPr>
+    </w:p>
+    <w:p>
+      <w:pPr>
+        <w:spacing w:line="360" w:lineRule="auto"/>
+        <w:jc w:val="both"/>
+        <w:rPr>
+          <w:rFonts w:ascii="Arial" w:hAnsi="Arial" w:cs="Arial"/>
+          <w:sz w:val="20"/>
+          <w:szCs w:val="20"/>
+        </w:rPr>
+      </w:pPr>
+      <w:r>
+        <w:rPr>
+          <w:rFonts w:ascii="Arial" w:hAnsi="Arial" w:cs="Arial"/>
+          <w:sz w:val="20"/>
+          <w:szCs w:val="20"/>
+        </w:rPr>
+        <w:t>________________________________________________</w:t>
+      </w:r>
+    </w:p>
+    <w:p>
+      <w:pPr>
+        <w:pStyle w:val="Corpodetexto"/>
+      </w:pPr>
+      <w:r>
+        <w:rPr>
+          <w:rFonts w:ascii="Arial" w:hAnsi="Arial"/>
+          <w:b/>
+          <w:color w:val="000000"/>
+        </w:rPr>
+        <w:t>Wesley Andre Melo</w:t>
+      </w:r>
+    </w:p>
+    <w:p>
+      <w:pPr>
+        <w:spacing w:line="360" w:lineRule="auto"/>
+        <w:jc w:val="both"/>
+        <w:rPr>
+          <w:rFonts w:ascii="Arial" w:hAnsi="Arial" w:cs="Arial"/>
           <w:sz w:val="20"/>
           <w:szCs w:val="20"/>
           <w:highlight w:val="yellow"/>
-        </w:rPr>
-        <w:t xml:space="preserve">SEM ABREVIAÇÕES </w:t>
-      </w:r>
-      <w:r>
+          <w:lang w:val="pt-PT"/>
+        </w:rPr>
+      </w:pPr>
+    </w:p>
+    <w:p>
+      <w:pPr>
+        <w:spacing w:line="360" w:lineRule="auto"/>
+        <w:jc w:val="both"/>
         <w:rPr>
           <w:rFonts w:ascii="Arial" w:hAnsi="Arial" w:cs="Arial"/>
           <w:sz w:val="20"/>
           <w:szCs w:val="20"/>
           <w:highlight w:val="yellow"/>
-        </w:rPr>
-        <w:t>DO(A) DISCENTE</w:t>
-      </w:r>
+          <w:lang w:val="pt-PT"/>
+        </w:rPr>
+      </w:pPr>
     </w:p>
     <w:p>
       <w:pPr>
@@ -2484,8 +2986,76 @@
           <w:sz w:val="20"/>
           <w:szCs w:val="20"/>
           <w:highlight w:val="yellow"/>
-        </w:rPr>
-      </w:pPr>
+          <w:lang w:val="pt-PT"/>
+        </w:rPr>
+      </w:pPr>
+    </w:p>
+    <w:p>
+      <w:pPr>
+        <w:spacing w:line="360" w:lineRule="auto"/>
+        <w:jc w:val="both"/>
+        <w:rPr>
+          <w:rFonts w:ascii="Arial" w:hAnsi="Arial" w:cs="Arial"/>
+          <w:sz w:val="20"/>
+          <w:szCs w:val="20"/>
+        </w:rPr>
+      </w:pPr>
+      <w:r>
+        <w:rPr>
+          <w:rFonts w:ascii="Arial" w:hAnsi="Arial" w:cs="Arial"/>
+          <w:sz w:val="20"/>
+          <w:szCs w:val="20"/>
+        </w:rPr>
+        <w:t>________________________________________________</w:t>
+      </w:r>
+    </w:p>
+    <w:p>
+      <w:pPr>
+        <w:pStyle w:val="Corpodetexto"/>
+        <w:spacing w:before="116"/>
+      </w:pPr>
+      <w:r>
+        <w:rPr>
+          <w:rFonts w:ascii="Arial" w:hAnsi="Arial"/>
+          <w:b/>
+          <w:color w:val="000000"/>
+        </w:rPr>
+        <w:t>Lucas</w:t>
+      </w:r>
+      <w:r>
+        <w:rPr>
+          <w:rFonts w:ascii="Arial" w:hAnsi="Arial"/>
+          <w:b/>
+          <w:color w:val="000000"/>
+          <w:spacing w:val="-4"/>
+        </w:rPr>
+        <w:t xml:space="preserve"> </w:t>
+      </w:r>
+      <w:r>
+        <w:rPr>
+          <w:rFonts w:ascii="Arial" w:hAnsi="Arial"/>
+          <w:b/>
+          <w:color w:val="000000"/>
+        </w:rPr>
+        <w:t>Cabral</w:t>
+      </w:r>
+      <w:r>
+        <w:rPr>
+          <w:rFonts w:ascii="Arial" w:hAnsi="Arial"/>
+          <w:b/>
+          <w:color w:val="000000"/>
+          <w:spacing w:val="-5"/>
+        </w:rPr>
+        <w:t xml:space="preserve"> </w:t>
+      </w:r>
+      <w:r>
+        <w:rPr>
+          <w:rFonts w:ascii="Arial" w:hAnsi="Arial"/>
+          <w:b/>
+          <w:color w:val="000000"/>
+        </w:rPr>
+        <w:t>Gouvea – Agente Externo</w:t>
+      </w:r>
     </w:p>
     <w:p>
       <w:pPr>
@@ -2496,451 +3066,9 @@
           <w:sz w:val="20"/>
           <w:szCs w:val="20"/>
           <w:highlight w:val="yellow"/>
-        </w:rPr>
-      </w:pPr>
-    </w:p>
-    <w:p>
-      <w:pPr>
-        <w:spacing w:line="360" w:lineRule="auto"/>
-        <w:jc w:val="both"/>
-        <w:rPr>
-          <w:rFonts w:ascii="Arial" w:hAnsi="Arial" w:cs="Arial"/>
-          <w:sz w:val="20"/>
-          <w:szCs w:val="20"/>
-        </w:rPr>
-      </w:pPr>
-    </w:p>
-    <w:p>
-      <w:pPr>
-        <w:spacing w:line="360" w:lineRule="auto"/>
-        <w:jc w:val="both"/>
-        <w:rPr>
-          <w:rFonts w:ascii="Arial" w:hAnsi="Arial" w:cs="Arial"/>
-          <w:sz w:val="20"/>
-          <w:szCs w:val="20"/>
-        </w:rPr>
-      </w:pPr>
-      <w:r>
-        <w:rPr>
-          <w:rFonts w:ascii="Arial" w:hAnsi="Arial" w:cs="Arial"/>
-          <w:sz w:val="20"/>
-          <w:szCs w:val="20"/>
-        </w:rPr>
-        <w:t>__________________________________________________</w:t>
-      </w:r>
-    </w:p>
-    <w:p>
-      <w:pPr>
-        <w:spacing w:line="360" w:lineRule="auto"/>
-        <w:jc w:val="both"/>
-        <w:rPr>
-          <w:rFonts w:ascii="Arial" w:hAnsi="Arial" w:cs="Arial"/>
-          <w:sz w:val="20"/>
-          <w:szCs w:val="20"/>
-          <w:highlight w:val="yellow"/>
-        </w:rPr>
-      </w:pPr>
-      <w:r>
-        <w:rPr>
-          <w:rFonts w:ascii="Arial" w:hAnsi="Arial" w:cs="Arial"/>
-          <w:sz w:val="20"/>
-          <w:szCs w:val="20"/>
-          <w:highlight w:val="yellow"/>
-        </w:rPr>
-        <w:t xml:space="preserve">NOME COMPLETO </w:t>
-      </w:r>
-      <w:r>
-        <w:rPr>
-          <w:rFonts w:ascii="Arial" w:hAnsi="Arial" w:cs="Arial"/>
-          <w:bCs/>
-          <w:sz w:val="20"/>
-          <w:szCs w:val="20"/>
-          <w:highlight w:val="yellow"/>
-        </w:rPr>
-        <w:t xml:space="preserve">SEM ABREVIAÇÕES </w:t>
-      </w:r>
-      <w:r>
-        <w:rPr>
-          <w:rFonts w:ascii="Arial" w:hAnsi="Arial" w:cs="Arial"/>
-          <w:sz w:val="20"/>
-          <w:szCs w:val="20"/>
-          <w:highlight w:val="yellow"/>
-        </w:rPr>
-        <w:t>DO(A) DISCENTE</w:t>
-      </w:r>
-    </w:p>
-    <w:p>
-      <w:pPr>
-        <w:spacing w:line="360" w:lineRule="auto"/>
-        <w:jc w:val="both"/>
-        <w:rPr>
-          <w:rFonts w:ascii="Arial" w:hAnsi="Arial" w:cs="Arial"/>
-          <w:sz w:val="20"/>
-          <w:szCs w:val="20"/>
-          <w:highlight w:val="yellow"/>
-        </w:rPr>
-      </w:pPr>
-    </w:p>
-    <w:p>
-      <w:pPr>
-        <w:spacing w:line="360" w:lineRule="auto"/>
-        <w:jc w:val="both"/>
-        <w:rPr>
-          <w:rFonts w:ascii="Arial" w:hAnsi="Arial" w:cs="Arial"/>
-          <w:sz w:val="20"/>
-          <w:szCs w:val="20"/>
-          <w:highlight w:val="yellow"/>
-        </w:rPr>
-      </w:pPr>
-    </w:p>
-    <w:p>
-      <w:pPr>
-        <w:spacing w:line="360" w:lineRule="auto"/>
-        <w:jc w:val="both"/>
-        <w:rPr>
-          <w:rFonts w:ascii="Arial" w:hAnsi="Arial" w:cs="Arial"/>
-          <w:sz w:val="20"/>
-          <w:szCs w:val="20"/>
-          <w:highlight w:val="yellow"/>
-        </w:rPr>
-      </w:pPr>
-    </w:p>
-    <w:p>
-      <w:pPr>
-        <w:spacing w:line="360" w:lineRule="auto"/>
-        <w:jc w:val="both"/>
-        <w:rPr>
-          <w:rFonts w:ascii="Arial" w:hAnsi="Arial" w:cs="Arial"/>
-          <w:sz w:val="20"/>
-          <w:szCs w:val="20"/>
-        </w:rPr>
-      </w:pPr>
-      <w:r>
-        <w:rPr>
-          <w:rFonts w:ascii="Arial" w:hAnsi="Arial" w:cs="Arial"/>
-          <w:sz w:val="20"/>
-          <w:szCs w:val="20"/>
-        </w:rPr>
-        <w:t>__________________________________________________</w:t>
-      </w:r>
-    </w:p>
-    <w:p>
-      <w:pPr>
-        <w:spacing w:line="360" w:lineRule="auto"/>
-        <w:jc w:val="both"/>
-        <w:rPr>
-          <w:rFonts w:ascii="Arial" w:hAnsi="Arial" w:cs="Arial"/>
-          <w:sz w:val="20"/>
-          <w:szCs w:val="20"/>
-          <w:highlight w:val="yellow"/>
-        </w:rPr>
-      </w:pPr>
-      <w:r>
-        <w:rPr>
-          <w:rFonts w:ascii="Arial" w:hAnsi="Arial" w:cs="Arial"/>
-          <w:sz w:val="20"/>
-          <w:szCs w:val="20"/>
-          <w:highlight w:val="yellow"/>
-        </w:rPr>
-        <w:t xml:space="preserve">NOME COMPLETO </w:t>
-      </w:r>
-      <w:r>
-        <w:rPr>
-          <w:rFonts w:ascii="Arial" w:hAnsi="Arial" w:cs="Arial"/>
-          <w:bCs/>
-          <w:sz w:val="20"/>
-          <w:szCs w:val="20"/>
-          <w:highlight w:val="yellow"/>
-        </w:rPr>
-        <w:t xml:space="preserve">SEM ABREVIAÇÕES </w:t>
-      </w:r>
-      <w:r>
-        <w:rPr>
-          <w:rFonts w:ascii="Arial" w:hAnsi="Arial" w:cs="Arial"/>
-          <w:sz w:val="20"/>
-          <w:szCs w:val="20"/>
-          <w:highlight w:val="yellow"/>
-        </w:rPr>
-        <w:t>DO(A) DISCENTE</w:t>
-      </w:r>
-    </w:p>
-    <w:p>
-      <w:pPr>
-        <w:spacing w:line="360" w:lineRule="auto"/>
-        <w:jc w:val="both"/>
-        <w:rPr>
-          <w:rFonts w:ascii="Arial" w:hAnsi="Arial" w:cs="Arial"/>
-          <w:sz w:val="20"/>
-          <w:szCs w:val="20"/>
-          <w:highlight w:val="yellow"/>
-        </w:rPr>
-      </w:pPr>
-    </w:p>
-    <w:p>
-      <w:pPr>
-        <w:spacing w:line="360" w:lineRule="auto"/>
-        <w:jc w:val="both"/>
-        <w:rPr>
-          <w:rFonts w:ascii="Arial" w:hAnsi="Arial" w:cs="Arial"/>
-          <w:sz w:val="20"/>
-          <w:szCs w:val="20"/>
-          <w:highlight w:val="yellow"/>
-        </w:rPr>
-      </w:pPr>
-    </w:p>
-    <w:p>
-      <w:pPr>
-        <w:spacing w:line="360" w:lineRule="auto"/>
-        <w:jc w:val="both"/>
-        <w:rPr>
-          <w:rFonts w:ascii="Arial" w:hAnsi="Arial" w:cs="Arial"/>
-          <w:sz w:val="20"/>
-          <w:szCs w:val="20"/>
-          <w:highlight w:val="yellow"/>
-        </w:rPr>
-      </w:pPr>
-    </w:p>
-    <w:p>
-      <w:pPr>
-        <w:spacing w:line="360" w:lineRule="auto"/>
-        <w:jc w:val="both"/>
-        <w:rPr>
-          <w:rFonts w:ascii="Arial" w:hAnsi="Arial" w:cs="Arial"/>
-          <w:sz w:val="20"/>
-          <w:szCs w:val="20"/>
-        </w:rPr>
-      </w:pPr>
-      <w:r>
-        <w:rPr>
-          <w:rFonts w:ascii="Arial" w:hAnsi="Arial" w:cs="Arial"/>
-          <w:sz w:val="20"/>
-          <w:szCs w:val="20"/>
-        </w:rPr>
-        <w:t>__________________________________________________</w:t>
-      </w:r>
-    </w:p>
-    <w:p>
-      <w:pPr>
-        <w:spacing w:line="360" w:lineRule="auto"/>
-        <w:jc w:val="both"/>
-        <w:rPr>
-          <w:rFonts w:ascii="Arial" w:hAnsi="Arial" w:cs="Arial"/>
-          <w:sz w:val="20"/>
-          <w:szCs w:val="20"/>
-          <w:highlight w:val="yellow"/>
-        </w:rPr>
-      </w:pPr>
-      <w:r>
-        <w:rPr>
-          <w:rFonts w:ascii="Arial" w:hAnsi="Arial" w:cs="Arial"/>
-          <w:sz w:val="20"/>
-          <w:szCs w:val="20"/>
-          <w:highlight w:val="yellow"/>
-        </w:rPr>
-        <w:t>NOME COMPLETO</w:t>
-      </w:r>
-      <w:r>
-        <w:rPr>
-          <w:rFonts w:ascii="Arial" w:hAnsi="Arial" w:cs="Arial"/>
-          <w:bCs/>
-          <w:sz w:val="20"/>
-          <w:szCs w:val="20"/>
-          <w:highlight w:val="yellow"/>
-        </w:rPr>
-        <w:t xml:space="preserve"> SEM ABREVIAÇÕES</w:t>
-      </w:r>
-      <w:r>
-        <w:rPr>
-          <w:rFonts w:ascii="Arial" w:hAnsi="Arial" w:cs="Arial"/>
-          <w:sz w:val="20"/>
-          <w:szCs w:val="20"/>
-          <w:highlight w:val="yellow"/>
-        </w:rPr>
-        <w:t xml:space="preserve"> DO(A) DISCENTE</w:t>
-      </w:r>
-    </w:p>
-    <w:p>
-      <w:pPr>
-        <w:spacing w:line="360" w:lineRule="auto"/>
-        <w:jc w:val="both"/>
-        <w:rPr>
-          <w:rFonts w:ascii="Arial" w:hAnsi="Arial" w:cs="Arial"/>
-          <w:sz w:val="20"/>
-          <w:szCs w:val="20"/>
-        </w:rPr>
-      </w:pPr>
-    </w:p>
-    <w:p>
-      <w:pPr>
-        <w:spacing w:line="360" w:lineRule="auto"/>
-        <w:jc w:val="both"/>
-        <w:rPr>
-          <w:rFonts w:ascii="Arial" w:hAnsi="Arial" w:cs="Arial"/>
-          <w:sz w:val="20"/>
-          <w:szCs w:val="20"/>
-        </w:rPr>
-      </w:pPr>
-    </w:p>
-    <w:p>
-      <w:pPr>
-        <w:spacing w:line="360" w:lineRule="auto"/>
-        <w:jc w:val="both"/>
-        <w:rPr>
-          <w:rFonts w:ascii="Arial" w:hAnsi="Arial" w:cs="Arial"/>
-          <w:sz w:val="20"/>
-          <w:szCs w:val="20"/>
-        </w:rPr>
-      </w:pPr>
-    </w:p>
-    <w:p>
-      <w:pPr>
-        <w:spacing w:line="360" w:lineRule="auto"/>
-        <w:jc w:val="both"/>
-        <w:rPr>
-          <w:rFonts w:ascii="Arial" w:hAnsi="Arial" w:cs="Arial"/>
-          <w:sz w:val="20"/>
-          <w:szCs w:val="20"/>
-        </w:rPr>
-      </w:pPr>
-      <w:r>
-        <w:rPr>
-          <w:rFonts w:ascii="Arial" w:hAnsi="Arial" w:cs="Arial"/>
-          <w:sz w:val="20"/>
-          <w:szCs w:val="20"/>
-        </w:rPr>
-        <w:t>__________________________________________________</w:t>
-      </w:r>
-    </w:p>
-    <w:p>
-      <w:pPr>
-        <w:spacing w:line="360" w:lineRule="auto"/>
-        <w:jc w:val="both"/>
-        <w:rPr>
-          <w:rFonts w:ascii="Arial" w:hAnsi="Arial" w:cs="Arial"/>
-          <w:sz w:val="20"/>
-          <w:szCs w:val="20"/>
-          <w:highlight w:val="yellow"/>
-        </w:rPr>
-      </w:pPr>
-      <w:r>
-        <w:rPr>
-          <w:rFonts w:ascii="Arial" w:hAnsi="Arial" w:cs="Arial"/>
-          <w:sz w:val="20"/>
-          <w:szCs w:val="20"/>
-          <w:highlight w:val="yellow"/>
-        </w:rPr>
-        <w:t xml:space="preserve">NOME COMPLETO </w:t>
-      </w:r>
-      <w:r>
-        <w:rPr>
-          <w:rFonts w:ascii="Arial" w:hAnsi="Arial" w:cs="Arial"/>
-          <w:bCs/>
-          <w:sz w:val="20"/>
-          <w:szCs w:val="20"/>
-          <w:highlight w:val="yellow"/>
-        </w:rPr>
-        <w:t xml:space="preserve">SEM ABREVIAÇÕES </w:t>
-      </w:r>
-      <w:r>
-        <w:rPr>
-          <w:rFonts w:ascii="Arial" w:hAnsi="Arial" w:cs="Arial"/>
-          <w:sz w:val="20"/>
-          <w:szCs w:val="20"/>
-          <w:highlight w:val="yellow"/>
-        </w:rPr>
-        <w:t>DO(A) DOCENTE</w:t>
-      </w:r>
-    </w:p>
-    <w:p>
-      <w:pPr>
-        <w:spacing w:line="360" w:lineRule="auto"/>
-        <w:jc w:val="both"/>
-        <w:rPr>
-          <w:rFonts w:ascii="Arial" w:hAnsi="Arial" w:cs="Arial"/>
-          <w:sz w:val="20"/>
-          <w:szCs w:val="20"/>
-        </w:rPr>
-      </w:pPr>
-    </w:p>
-    <w:p>
-      <w:pPr>
-        <w:spacing w:line="360" w:lineRule="auto"/>
-        <w:jc w:val="both"/>
-        <w:rPr>
-          <w:rFonts w:ascii="Arial" w:hAnsi="Arial" w:cs="Arial"/>
-          <w:sz w:val="20"/>
-          <w:szCs w:val="20"/>
-        </w:rPr>
-      </w:pPr>
-    </w:p>
-    <w:p>
-      <w:pPr>
-        <w:spacing w:line="360" w:lineRule="auto"/>
-        <w:jc w:val="both"/>
-        <w:rPr>
-          <w:rFonts w:ascii="Arial" w:hAnsi="Arial" w:cs="Arial"/>
-          <w:sz w:val="20"/>
-          <w:szCs w:val="20"/>
-        </w:rPr>
-      </w:pPr>
-    </w:p>
-    <w:p>
-      <w:pPr>
-        <w:spacing w:line="360" w:lineRule="auto"/>
-        <w:jc w:val="both"/>
-        <w:rPr>
-          <w:rFonts w:ascii="Arial" w:hAnsi="Arial" w:cs="Arial"/>
-          <w:sz w:val="20"/>
-          <w:szCs w:val="20"/>
-        </w:rPr>
-      </w:pPr>
-      <w:r>
-        <w:rPr>
-          <w:rFonts w:ascii="Arial" w:hAnsi="Arial" w:cs="Arial"/>
-          <w:sz w:val="20"/>
-          <w:szCs w:val="20"/>
-        </w:rPr>
-        <w:t>__________________________________________________</w:t>
-      </w:r>
-    </w:p>
-    <w:p>
-      <w:pPr>
-        <w:spacing w:line="360" w:lineRule="auto"/>
-        <w:jc w:val="both"/>
-        <w:rPr>
-          <w:rFonts w:ascii="Arial" w:hAnsi="Arial" w:cs="Arial"/>
-          <w:sz w:val="20"/>
-          <w:szCs w:val="20"/>
-          <w:highlight w:val="yellow"/>
-        </w:rPr>
-      </w:pPr>
-      <w:r>
-        <w:rPr>
-          <w:rFonts w:ascii="Arial" w:hAnsi="Arial" w:cs="Arial"/>
-          <w:sz w:val="20"/>
-          <w:szCs w:val="20"/>
-          <w:highlight w:val="yellow"/>
-        </w:rPr>
-        <w:t>NOME DO</w:t>
-      </w:r>
-      <w:r>
-        <w:rPr>
-          <w:rFonts w:ascii="Arial" w:hAnsi="Arial" w:cs="Arial"/>
-          <w:sz w:val="20"/>
-          <w:szCs w:val="20"/>
-          <w:highlight w:val="yellow"/>
-        </w:rPr>
-        <w:t>(A)</w:t>
-      </w:r>
-      <w:r>
-        <w:rPr>
-          <w:rFonts w:ascii="Arial" w:hAnsi="Arial" w:cs="Arial"/>
-          <w:sz w:val="20"/>
-          <w:szCs w:val="20"/>
-          <w:highlight w:val="yellow"/>
-        </w:rPr>
-        <w:t xml:space="preserve"> STAKEHOLDER EXTERNO</w:t>
-      </w:r>
+          <w:lang w:val="pt-PT"/>
+        </w:rPr>
+      </w:pPr>
     </w:p>
     <w:sectPr>
       <w:pgSz w:w="12240" w:h="15840"/>
@@ -2953,7 +3081,7 @@
 </file>
 
 <file path=word/styles.xml><?xml version="1.0" encoding="utf-8"?>
-<w:styles xmlns:mc="http://schemas.openxmlformats.org/markup-compatibility/2006" xmlns:r="http://schemas.openxmlformats.org/officeDocument/2006/relationships" xmlns:w="http://schemas.openxmlformats.org/wordprocessingml/2006/main" xmlns:w14="http://schemas.microsoft.com/office/word/2010/wordml" xmlns:w15="http://schemas.microsoft.com/office/word/2012/wordml" xmlns:w16cid="http://schemas.microsoft.com/office/word/2016/wordml/cid" xmlns:w16se="http://schemas.microsoft.com/office/word/2015/wordml/symex" mc:Ignorable="w14 w15 w16se w16cid">
+<w:styles xmlns:mc="http://schemas.openxmlformats.org/markup-compatibility/2006" xmlns:r="http://schemas.openxmlformats.org/officeDocument/2006/relationships" xmlns:w="http://schemas.openxmlformats.org/wordprocessingml/2006/main" xmlns:w14="http://schemas.microsoft.com/office/word/2010/wordml" xmlns:w15="http://schemas.microsoft.com/office/word/2012/wordml" xmlns:w16cex="http://schemas.microsoft.com/office/word/2018/wordml/cex" xmlns:w16cid="http://schemas.microsoft.com/office/word/2016/wordml/cid" xmlns:w16="http://schemas.microsoft.com/office/word/2018/wordml" xmlns:w16sdtdh="http://schemas.microsoft.com/office/word/2020/wordml/sdtdatahash" xmlns:w16se="http://schemas.microsoft.com/office/word/2015/wordml/symex" mc:Ignorable="w14 w15 w16se w16cid w16 w16cex w16sdtdh">
   <w:docDefaults>
     <w:rPrDefault>
       <w:rPr>
@@ -2963,7 +3091,7 @@
     </w:rPrDefault>
     <w:pPrDefault/>
   </w:docDefaults>
-  <w:latentStyles w:defLockedState="0" w:defUIPriority="0" w:defSemiHidden="0" w:defUnhideWhenUsed="0" w:defQFormat="0" w:count="375">
+  <w:latentStyles w:defLockedState="0" w:defUIPriority="0" w:defSemiHidden="0" w:defUnhideWhenUsed="0" w:defQFormat="0" w:count="376">
     <w:lsdException w:name="Normal" w:qFormat="1"/>
     <w:lsdException w:name="heading 1" w:qFormat="1"/>
     <w:lsdException w:name="heading 2" w:semiHidden="1" w:unhideWhenUsed="1" w:qFormat="1"/>
@@ -2976,6 +3104,7 @@
     <w:lsdException w:name="heading 9" w:semiHidden="1" w:unhideWhenUsed="1" w:qFormat="1"/>
     <w:lsdException w:name="caption" w:semiHidden="1" w:unhideWhenUsed="1" w:qFormat="1"/>
     <w:lsdException w:name="Title" w:qFormat="1"/>
+    <w:lsdException w:name="Body Text" w:uiPriority="1" w:qFormat="1"/>
     <w:lsdException w:name="Subtitle" w:qFormat="1"/>
     <w:lsdException w:name="Strong" w:qFormat="1"/>
     <w:lsdException w:name="Emphasis" w:qFormat="1"/>
@@ -3242,6 +3371,7 @@
     <w:lsdException w:name="Smart Hyperlink" w:semiHidden="1" w:uiPriority="99" w:unhideWhenUsed="1"/>
     <w:lsdException w:name="Hashtag" w:semiHidden="1" w:uiPriority="99" w:unhideWhenUsed="1"/>
     <w:lsdException w:name="Unresolved Mention" w:semiHidden="1" w:uiPriority="99" w:unhideWhenUsed="1"/>
+    <w:lsdException w:name="Smart Link" w:semiHidden="1" w:uiPriority="99" w:unhideWhenUsed="1"/>
   </w:latentStyles>
   <w:style w:type="paragraph" w:default="1" w:styleId="Normal">
     <w:name w:val="Normal"/>
@@ -3278,6 +3408,36 @@
     <w:uiPriority w:val="99"/>
     <w:semiHidden/>
     <w:unhideWhenUsed/>
+  </w:style>
+  <w:style w:type="paragraph" w:styleId="Corpodetexto">
+    <w:name w:val="Body Text"/>
+    <w:basedOn w:val="Normal"/>
+    <w:link w:val="CorpodetextoChar"/>
+    <w:uiPriority w:val="1"/>
+    <w:qFormat/>
+    <w:rsid w:val="00F456A4"/>
+    <w:pPr>
+      <w:widowControl w:val="0"/>
+      <w:autoSpaceDE w:val="0"/>
+      <w:autoSpaceDN w:val="0"/>
+    </w:pPr>
+    <w:rPr>
+      <w:rFonts w:ascii="Arial MT" w:eastAsia="Arial MT" w:hAnsi="Arial MT" w:cs="Arial MT"/>
+      <w:sz w:val="20"/>
+      <w:szCs w:val="20"/>
+      <w:lang w:val="pt-PT" w:eastAsia="en-US"/>
+    </w:rPr>
+  </w:style>
+  <w:style w:type="character" w:customStyle="1" w:styleId="CorpodetextoChar">
+    <w:name w:val="Corpo de texto Char"/>
+    <w:basedOn w:val="Fontepargpadro"/>
+    <w:link w:val="Corpodetexto"/>
+    <w:uiPriority w:val="1"/>
+    <w:rsid w:val="00F456A4"/>
+    <w:rPr>
+      <w:rFonts w:ascii="Arial MT" w:eastAsia="Arial MT" w:hAnsi="Arial MT" w:cs="Arial MT"/>
+      <w:lang w:val="pt-PT" w:eastAsia="en-US"/>
+    </w:rPr>
   </w:style>
 </w:styles>
 </file>

</xml_diff>